<commit_message>
Simplify intro workflow header
</commit_message>
<xml_diff>
--- a/intro Website/Outline/Outline.docx
+++ b/intro Website/Outline/Outline.docx
@@ -42,130 +42,40 @@
     </w:p>
     <w:p>
       <w:pPr>
-        <w:pStyle w:val="Lead"/>
-        <w:rPr>
-          <w:lang w:eastAsia="zh-TW"/>
-        </w:rPr>
-      </w:pPr>
-      <w:r>
-        <w:rPr>
-          <w:rFonts w:cs="Apple LiSung"/>
-          <w:lang w:eastAsia="zh-TW"/>
-        </w:rPr>
-        <w:t>本稿以《Outline 2.docx》及重寫建議為基礎，將原有提綱改寫為附有小標題的段落式規劃稿。每一節均說明其目的、主要內容、讀者應掌握的重點，以及適合加入的截圖、圖表或案例。本文將網站定位為研究奏摺與上諭的可重用數位人文平台；林爽文事件只作為展示系統如何運作的示範案例。</w:t>
-      </w:r>
-    </w:p>
-    <w:tbl>
-      <w:tblPr>
-        <w:tblW w:w="0" w:type="auto"/>
-        <w:tblLayout w:type="fixed"/>
-        <w:tblLook w:val="04A0" w:firstRow="1" w:lastRow="0" w:firstColumn="1" w:lastColumn="0" w:noHBand="0" w:noVBand="1"/>
-      </w:tblPr>
-      <w:tblGrid>
-        <w:gridCol w:w="9360"/>
-      </w:tblGrid>
-      <w:tr>
-        <w:tc>
-          <w:tcPr>
-            <w:tcW w:w="9360" w:type="dxa"/>
-            <w:shd w:val="clear" w:color="auto" w:fill="F4F6F9"/>
-            <w:tcMar>
-              <w:top w:w="140" w:type="dxa"/>
-              <w:left w:w="180" w:type="dxa"/>
-              <w:bottom w:w="140" w:type="dxa"/>
-              <w:right w:w="180" w:type="dxa"/>
-            </w:tcMar>
-            <w:vAlign w:val="center"/>
-          </w:tcPr>
-          <w:p>
-            <w:pPr>
-              <w:spacing w:after="0"/>
-              <w:rPr>
-                <w:lang w:eastAsia="zh-TW"/>
-              </w:rPr>
-            </w:pPr>
-            <w:r>
-              <w:rPr>
-                <w:rFonts w:cs="Apple LiSung"/>
-                <w:b/>
-                <w:color w:val="1F4D78"/>
-                <w:lang w:eastAsia="zh-TW"/>
-              </w:rPr>
-              <w:t>全稿敘事主線：</w:t>
-            </w:r>
-            <w:r>
-              <w:rPr>
-                <w:rFonts w:cs="Apple LiSung"/>
-                <w:lang w:eastAsia="zh-TW"/>
-              </w:rPr>
-              <w:t>認識研究材料 → 理解研究困難 → 了解平台如何運作 → 學習如何重用方法 → 觀察平台可以產生的歷史分析。</w:t>
-            </w:r>
-          </w:p>
-        </w:tc>
-      </w:tr>
-    </w:tbl>
-    <w:p>
-      <w:pPr>
-        <w:spacing w:after="20"/>
-        <w:rPr>
-          <w:lang w:eastAsia="zh-TW"/>
-        </w:rPr>
-      </w:pPr>
-    </w:p>
-    <w:p>
-      <w:pPr>
-        <w:rPr>
-          <w:lang w:eastAsia="zh-TW"/>
-        </w:rPr>
-      </w:pPr>
-      <w:r>
-        <w:rPr>
-          <w:rFonts w:cs="Apple LiSung"/>
-          <w:lang w:eastAsia="zh-TW"/>
-        </w:rPr>
-        <w:t>編排原則：每個小節依照「目的—內容安排—示例或畫面—讀者帶走的重點」展開。最深層的操作項目可以保留少量條列，以方便讀者查閱；其餘內容則以可直接發展成網站文章的段落呈現。</w:t>
-      </w:r>
-    </w:p>
-    <w:p>
-      <w:pPr>
-        <w:pageBreakBefore/>
-        <w:rPr>
-          <w:lang w:eastAsia="zh-TW"/>
-        </w:rPr>
-      </w:pPr>
-    </w:p>
-    <w:p>
-      <w:pPr>
         <w:spacing w:before="80" w:after="240"/>
         <w:jc w:val="left"/>
-      </w:pPr>
-      <w:proofErr w:type="spellStart"/>
+        <w:rPr>
+          <w:lang w:eastAsia="zh-TW"/>
+        </w:rPr>
+      </w:pPr>
       <w:r>
         <w:rPr>
           <w:rFonts w:cs="Apple LiSung"/>
           <w:b/>
           <w:color w:val="2E74B5"/>
           <w:sz w:val="36"/>
+          <w:lang w:eastAsia="zh-TW"/>
         </w:rPr>
         <w:t>內容目錄</w:t>
       </w:r>
-      <w:proofErr w:type="spellEnd"/>
     </w:p>
     <w:p>
       <w:pPr>
         <w:spacing w:before="100" w:after="40"/>
-      </w:pPr>
-      <w:proofErr w:type="spellStart"/>
+        <w:rPr>
+          <w:lang w:eastAsia="zh-TW"/>
+        </w:rPr>
+      </w:pPr>
       <w:r>
         <w:rPr>
           <w:rFonts w:cs="Apple LiSung"/>
           <w:b/>
           <w:color w:val="1F4D78"/>
           <w:sz w:val="24"/>
+          <w:lang w:eastAsia="zh-TW"/>
         </w:rPr>
         <w:t>二、封面</w:t>
       </w:r>
-      <w:proofErr w:type="spellEnd"/>
     </w:p>
     <w:p>
       <w:pPr>
@@ -386,7 +296,6 @@
         <w:spacing w:before="40" w:after="40"/>
         <w:ind w:left="806"/>
         <w:rPr>
-          <w:rFonts w:hint="eastAsia"/>
           <w:lang w:eastAsia="zh-TW"/>
         </w:rPr>
       </w:pPr>
@@ -412,12 +321,6 @@
           <w:lang w:eastAsia="zh-TW"/>
         </w:rPr>
         <w:tab/>
-      </w:r>
-      <w:r>
-        <w:rPr>
-          <w:rFonts w:cs="Apple LiSung"/>
-          <w:lang w:eastAsia="zh-TW"/>
-        </w:rPr>
         <w:t>5.3.3 重建通信關係</w:t>
       </w:r>
     </w:p>
@@ -435,12 +338,6 @@
           <w:lang w:eastAsia="zh-TW"/>
         </w:rPr>
         <w:tab/>
-      </w:r>
-      <w:r>
-        <w:rPr>
-          <w:rFonts w:cs="Apple LiSung"/>
-          <w:lang w:eastAsia="zh-TW"/>
-        </w:rPr>
         <w:t>5.3.4 資訊提取的核心理念</w:t>
       </w:r>
     </w:p>
@@ -465,12 +362,6 @@
           <w:lang w:eastAsia="zh-TW"/>
         </w:rPr>
         <w:tab/>
-      </w:r>
-      <w:r>
-        <w:rPr>
-          <w:rFonts w:cs="Apple LiSung"/>
-          <w:lang w:eastAsia="zh-TW"/>
-        </w:rPr>
         <w:t>5.3.4.1 奏摺分析分支</w:t>
       </w:r>
     </w:p>
@@ -495,12 +386,6 @@
           <w:lang w:eastAsia="zh-TW"/>
         </w:rPr>
         <w:tab/>
-      </w:r>
-      <w:r>
-        <w:rPr>
-          <w:rFonts w:cs="Apple LiSung"/>
-          <w:lang w:eastAsia="zh-TW"/>
-        </w:rPr>
         <w:t>5.3.4.2 上諭分析分支</w:t>
       </w:r>
     </w:p>
@@ -525,12 +410,6 @@
           <w:lang w:eastAsia="zh-TW"/>
         </w:rPr>
         <w:tab/>
-      </w:r>
-      <w:r>
-        <w:rPr>
-          <w:rFonts w:cs="Apple LiSung"/>
-          <w:lang w:eastAsia="zh-TW"/>
-        </w:rPr>
         <w:t>5.3.4.3 每項技能的展示方式</w:t>
       </w:r>
     </w:p>
@@ -579,6 +458,7 @@
           <w:rFonts w:cs="Apple LiSung"/>
           <w:lang w:eastAsia="zh-TW"/>
         </w:rPr>
+        <w:lastRenderedPageBreak/>
         <w:t>5.4.2 文書區與人工智能分析區</w:t>
       </w:r>
     </w:p>
@@ -661,7 +541,6 @@
           <w:rFonts w:cs="Apple LiSung"/>
           <w:lang w:eastAsia="zh-TW"/>
         </w:rPr>
-        <w:lastRenderedPageBreak/>
         <w:t>6.2 準備新的歷史材料</w:t>
       </w:r>
     </w:p>
@@ -1730,6 +1609,28 @@
     </w:p>
     <w:p>
       <w:pPr>
+        <w:spacing w:after="200" w:line="276" w:lineRule="auto"/>
+        <w:jc w:val="left"/>
+        <w:rPr>
+          <w:rFonts w:cs="Apple LiSung"/>
+          <w:b/>
+          <w:bCs/>
+          <w:color w:val="2E74B5"/>
+          <w:sz w:val="32"/>
+          <w:szCs w:val="28"/>
+          <w:lang w:eastAsia="zh-TW"/>
+        </w:rPr>
+      </w:pPr>
+      <w:r>
+        <w:rPr>
+          <w:rFonts w:cs="Apple LiSung"/>
+          <w:lang w:eastAsia="zh-TW"/>
+        </w:rPr>
+        <w:br w:type="page"/>
+      </w:r>
+    </w:p>
+    <w:p>
+      <w:pPr>
         <w:pStyle w:val="Heading1"/>
         <w:rPr>
           <w:lang w:eastAsia="zh-TW"/>
@@ -1740,6 +1641,7 @@
           <w:rFonts w:ascii="Apple LiSung" w:eastAsia="Apple LiSung" w:hAnsi="Apple LiSung" w:cs="Apple LiSung"/>
           <w:lang w:eastAsia="zh-TW"/>
         </w:rPr>
+        <w:lastRenderedPageBreak/>
         <w:t>五、平台介紹：由整體介面到核心流程</w:t>
       </w:r>
     </w:p>
@@ -1783,7 +1685,6 @@
           <w:rFonts w:ascii="Apple LiSung" w:eastAsia="Apple LiSung" w:hAnsi="Apple LiSung" w:cs="Apple LiSung"/>
           <w:lang w:eastAsia="zh-TW"/>
         </w:rPr>
-        <w:lastRenderedPageBreak/>
         <w:t>5.1 網站介面</w:t>
       </w:r>
     </w:p>
@@ -1849,6 +1750,28 @@
     </w:p>
     <w:p>
       <w:pPr>
+        <w:spacing w:after="200" w:line="276" w:lineRule="auto"/>
+        <w:jc w:val="left"/>
+        <w:rPr>
+          <w:rFonts w:cs="Apple LiSung"/>
+          <w:b/>
+          <w:bCs/>
+          <w:color w:val="2E74B5"/>
+          <w:sz w:val="26"/>
+          <w:szCs w:val="26"/>
+          <w:lang w:eastAsia="zh-TW"/>
+        </w:rPr>
+      </w:pPr>
+      <w:r>
+        <w:rPr>
+          <w:rFonts w:cs="Apple LiSung"/>
+          <w:lang w:eastAsia="zh-TW"/>
+        </w:rPr>
+        <w:br w:type="page"/>
+      </w:r>
+    </w:p>
+    <w:p>
+      <w:pPr>
         <w:pStyle w:val="Heading2"/>
         <w:rPr>
           <w:lang w:eastAsia="zh-TW"/>
@@ -1859,6 +1782,7 @@
           <w:rFonts w:ascii="Apple LiSung" w:eastAsia="Apple LiSung" w:hAnsi="Apple LiSung" w:cs="Apple LiSung"/>
           <w:lang w:eastAsia="zh-TW"/>
         </w:rPr>
+        <w:lastRenderedPageBreak/>
         <w:t>5.2 整體研究流程</w:t>
       </w:r>
     </w:p>
@@ -2021,7 +1945,6 @@
           <w:rFonts w:cs="Apple LiSung"/>
           <w:lang w:eastAsia="zh-TW"/>
         </w:rPr>
-        <w:lastRenderedPageBreak/>
         <w:t>示例畫面：一份原始文本如何對應到 JSON 欄位。</w:t>
       </w:r>
     </w:p>
@@ -2097,6 +2020,7 @@
           <w:rFonts w:cs="Apple LiSung"/>
           <w:lang w:eastAsia="zh-TW"/>
         </w:rPr>
+        <w:lastRenderedPageBreak/>
         <w:t>研究目標：這項技能要解決甚麼歷史問題？</w:t>
       </w:r>
     </w:p>
@@ -2295,7 +2219,6 @@
           <w:rFonts w:cs="Apple LiSung"/>
           <w:lang w:eastAsia="zh-TW"/>
         </w:rPr>
-        <w:lastRenderedPageBreak/>
         <w:t>AI Skills → 結構化結果 → 網站分析區 → 原文核對 → 已確認資料 → 圖表和分析。</w:t>
       </w:r>
     </w:p>
@@ -2371,6 +2294,7 @@
           <w:rFonts w:cs="Apple LiSung"/>
           <w:lang w:eastAsia="zh-TW"/>
         </w:rPr>
+        <w:lastRenderedPageBreak/>
         <w:t>清方行動：清軍部署、戰鬥、調兵和前線處置。</w:t>
       </w:r>
     </w:p>
@@ -2475,10 +2399,42 @@
       </w:pPr>
       <w:r>
         <w:rPr>
-          <w:rFonts w:cs="Apple LiSung"/>
-          <w:lang w:eastAsia="zh-TW"/>
-        </w:rPr>
-        <w:t>皇帝在硃批和上諭中的評論、命令和行動。</w:t>
+          <w:rFonts w:cs="Apple LiSung" w:hint="eastAsia"/>
+          <w:lang w:eastAsia="zh-TW"/>
+        </w:rPr>
+        <w:t xml:space="preserve">the previous official docs that the </w:t>
+      </w:r>
+      <w:proofErr w:type="spellStart"/>
+      <w:r>
+        <w:rPr>
+          <w:rFonts w:cs="Apple LiSung" w:hint="eastAsia"/>
+          <w:lang w:eastAsia="zh-TW"/>
+        </w:rPr>
+        <w:t>yu</w:t>
+      </w:r>
+      <w:proofErr w:type="spellEnd"/>
+      <w:r>
+        <w:rPr>
+          <w:rFonts w:cs="Apple LiSung" w:hint="eastAsia"/>
+          <w:lang w:eastAsia="zh-TW"/>
+        </w:rPr>
+        <w:t xml:space="preserve"> is </w:t>
+      </w:r>
+      <w:proofErr w:type="spellStart"/>
+      <w:r>
+        <w:rPr>
+          <w:rFonts w:cs="Apple LiSung" w:hint="eastAsia"/>
+          <w:lang w:eastAsia="zh-TW"/>
+        </w:rPr>
+        <w:t>respondong</w:t>
+      </w:r>
+      <w:proofErr w:type="spellEnd"/>
+      <w:r>
+        <w:rPr>
+          <w:rFonts w:cs="Apple LiSung" w:hint="eastAsia"/>
+          <w:lang w:eastAsia="zh-TW"/>
+        </w:rPr>
+        <w:t xml:space="preserve"> to </w:t>
       </w:r>
     </w:p>
     <w:p>
@@ -2494,50 +2450,7 @@
           <w:rFonts w:cs="Apple LiSung"/>
           <w:lang w:eastAsia="zh-TW"/>
         </w:rPr>
-        <w:t>地方官員可能需要採取的後續行動。</w:t>
-      </w:r>
-    </w:p>
-    <w:p>
-      <w:pPr>
-        <w:pStyle w:val="Heading3"/>
-        <w:rPr>
-          <w:lang w:eastAsia="zh-TW"/>
-        </w:rPr>
-      </w:pPr>
-      <w:r>
-        <w:rPr>
-          <w:rFonts w:ascii="Apple LiSung" w:eastAsia="Apple LiSung" w:hAnsi="Apple LiSung" w:cs="Apple LiSung"/>
-          <w:lang w:eastAsia="zh-TW"/>
-        </w:rPr>
-        <w:t>5.3.4.3 每項技能的展示方式</w:t>
-      </w:r>
-    </w:p>
-    <w:p>
-      <w:pPr>
-        <w:rPr>
-          <w:lang w:eastAsia="zh-TW"/>
-        </w:rPr>
-      </w:pPr>
-      <w:r>
-        <w:rPr>
-          <w:rFonts w:cs="Apple LiSung"/>
-          <w:lang w:eastAsia="zh-TW"/>
-        </w:rPr>
-        <w:t>網站不應把完整提示詞直接堆放在讀者面前，而應以歷史研究問題為中心介紹每項技能。每個技能小節先說明它要解決的問題，再解釋為甚麼這項資訊對研究重要，然後簡述指令如何限制提取範圍，最後展示一個真實或經核驗的 JSON 輸出。</w:t>
-      </w:r>
-    </w:p>
-    <w:p>
-      <w:pPr>
-        <w:rPr>
-          <w:lang w:eastAsia="zh-TW"/>
-        </w:rPr>
-      </w:pPr>
-      <w:r>
-        <w:rPr>
-          <w:rFonts w:cs="Apple LiSung"/>
-          <w:lang w:eastAsia="zh-TW"/>
-        </w:rPr>
-        <w:t>這種一致格式把人工智能提示放回研究方法的位置。讀者學到的不是如何複製一個只適用於林爽文事件的提示，而是如何把新的研究問題轉化為分類、證據和輸出規格。</w:t>
+        <w:t>皇帝在硃批和上諭中的評論、命令和行動。</w:t>
       </w:r>
     </w:p>
     <w:p>
@@ -2553,7 +2466,50 @@
           <w:rFonts w:cs="Apple LiSung"/>
           <w:lang w:eastAsia="zh-TW"/>
         </w:rPr>
-        <w:t>研究目標：這項技能要回答甚麼問題？</w:t>
+        <w:t>地方官員可能需要採取的後續行動。</w:t>
+      </w:r>
+    </w:p>
+    <w:p>
+      <w:pPr>
+        <w:pStyle w:val="Heading3"/>
+        <w:rPr>
+          <w:lang w:eastAsia="zh-TW"/>
+        </w:rPr>
+      </w:pPr>
+      <w:r>
+        <w:rPr>
+          <w:rFonts w:ascii="Apple LiSung" w:eastAsia="Apple LiSung" w:hAnsi="Apple LiSung" w:cs="Apple LiSung"/>
+          <w:lang w:eastAsia="zh-TW"/>
+        </w:rPr>
+        <w:t>5.3.4.3 每項技能的展示方式</w:t>
+      </w:r>
+    </w:p>
+    <w:p>
+      <w:pPr>
+        <w:rPr>
+          <w:lang w:eastAsia="zh-TW"/>
+        </w:rPr>
+      </w:pPr>
+      <w:r>
+        <w:rPr>
+          <w:rFonts w:cs="Apple LiSung"/>
+          <w:lang w:eastAsia="zh-TW"/>
+        </w:rPr>
+        <w:t>網站不應把完整提示詞直接堆放在讀者面前，而應以歷史研究問題為中心介紹每項技能。每個技能小節先說明它要解決的問題，再解釋為甚麼這項資訊對研究重要，然後簡述指令如何限制提取範圍，最後展示一個真實或經核驗的 JSON 輸出。</w:t>
+      </w:r>
+    </w:p>
+    <w:p>
+      <w:pPr>
+        <w:rPr>
+          <w:lang w:eastAsia="zh-TW"/>
+        </w:rPr>
+      </w:pPr>
+      <w:r>
+        <w:rPr>
+          <w:rFonts w:cs="Apple LiSung"/>
+          <w:lang w:eastAsia="zh-TW"/>
+        </w:rPr>
+        <w:t>這種一致格式把人工智能提示放回研究方法的位置。讀者學到的不是如何複製一個只適用於林爽文事件的提示，而是如何把新的研究問題轉化為分類、證據和輸出規格。</w:t>
       </w:r>
     </w:p>
     <w:p>
@@ -2569,7 +2525,7 @@
           <w:rFonts w:cs="Apple LiSung"/>
           <w:lang w:eastAsia="zh-TW"/>
         </w:rPr>
-        <w:t>歷史意義：為甚麼這項資訊值得提取？</w:t>
+        <w:t>研究目標：這項技能要回答甚麼問題？</w:t>
       </w:r>
     </w:p>
     <w:p>
@@ -2585,8 +2541,7 @@
           <w:rFonts w:cs="Apple LiSung"/>
           <w:lang w:eastAsia="zh-TW"/>
         </w:rPr>
-        <w:lastRenderedPageBreak/>
-        <w:t>技能設計：規則、排除條件和證據要求如何工作？</w:t>
+        <w:t>歷史意義：為甚麼這項資訊值得提取？</w:t>
       </w:r>
     </w:p>
     <w:p>
@@ -2602,93 +2557,7 @@
           <w:rFonts w:cs="Apple LiSung"/>
           <w:lang w:eastAsia="zh-TW"/>
         </w:rPr>
-        <w:t>結果示例：輸出如何回到原文並進入網站？</w:t>
-      </w:r>
-    </w:p>
-    <w:p>
-      <w:pPr>
-        <w:pStyle w:val="Heading2"/>
-        <w:rPr>
-          <w:lang w:eastAsia="zh-TW"/>
-        </w:rPr>
-      </w:pPr>
-      <w:r>
-        <w:rPr>
-          <w:rFonts w:ascii="Apple LiSung" w:eastAsia="Apple LiSung" w:hAnsi="Apple LiSung" w:cs="Apple LiSung"/>
-          <w:lang w:eastAsia="zh-TW"/>
-        </w:rPr>
-        <w:t>5.4 網站介面：由圖表回到原文</w:t>
-      </w:r>
-    </w:p>
-    <w:p>
-      <w:pPr>
-        <w:rPr>
-          <w:lang w:eastAsia="zh-TW"/>
-        </w:rPr>
-      </w:pPr>
-      <w:r>
-        <w:rPr>
-          <w:rFonts w:cs="Apple LiSung"/>
-          <w:lang w:eastAsia="zh-TW"/>
-        </w:rPr>
-        <w:t>介面介紹應按照資料在網站中被使用的順序展開：先是宏觀圖表，再是文書和人工智能核驗區，最後是個別節點資訊及事件線。這個順序讓讀者明白，視覺化不是取代原文，而是提供一個進入原文和比較文書關係的入口。</w:t>
-      </w:r>
-    </w:p>
-    <w:p>
-      <w:pPr>
-        <w:pStyle w:val="Heading3"/>
-        <w:rPr>
-          <w:lang w:eastAsia="zh-TW"/>
-        </w:rPr>
-      </w:pPr>
-      <w:r>
-        <w:rPr>
-          <w:rFonts w:ascii="Apple LiSung" w:eastAsia="Apple LiSung" w:hAnsi="Apple LiSung" w:cs="Apple LiSung"/>
-          <w:lang w:eastAsia="zh-TW"/>
-        </w:rPr>
-        <w:t>5.4.1 四線圖表：呈現時間、事件和通信</w:t>
-      </w:r>
-    </w:p>
-    <w:p>
-      <w:pPr>
-        <w:rPr>
-          <w:lang w:eastAsia="zh-TW"/>
-        </w:rPr>
-      </w:pPr>
-      <w:r>
-        <w:rPr>
-          <w:rFonts w:cs="Apple LiSung"/>
-          <w:lang w:eastAsia="zh-TW"/>
-        </w:rPr>
-        <w:t>圖表以四條水平線分開不同類型的歷史資訊。第一條線呈現事件實際發生的時間；其他線分別呈現官員文書或奏報、皇帝的硃批與上諭，以及由皇帝評論、命令或行動形成的決策節點。四條線把「事情何時發生」、「官員何時報告」、「皇帝何時收到和回應」及「地方何時再次回報」放在同一時間尺度上。</w:t>
-      </w:r>
-    </w:p>
-    <w:p>
-      <w:pPr>
-        <w:rPr>
-          <w:lang w:eastAsia="zh-TW"/>
-        </w:rPr>
-      </w:pPr>
-      <w:r>
-        <w:rPr>
-          <w:rFonts w:cs="Apple LiSung"/>
-          <w:lang w:eastAsia="zh-TW"/>
-        </w:rPr>
-        <w:t>每個節點只有在人工智能技能提取出主題句、詳細描述、原文引文和日期，並由研究者核對批准後才會加入圖表。事件節點可以連到官員奏報節點，表示事件由哪份文書上報；奏報節點再連到硃批或上諭，表示皇帝何時接收和回應；皇帝行動節點則可以連到後續官員文書，表示地方何時回應或執行命令。</w:t>
-      </w:r>
-    </w:p>
-    <w:p>
-      <w:pPr>
-        <w:rPr>
-          <w:lang w:eastAsia="zh-TW"/>
-        </w:rPr>
-      </w:pPr>
-      <w:r>
-        <w:rPr>
-          <w:rFonts w:cs="Apple LiSung"/>
-          <w:lang w:eastAsia="zh-TW"/>
-        </w:rPr>
-        <w:t>因此，圖表同時具備時間線和通信網絡兩種功能。節點的位置顯示事件、發出、收受和回覆之間的時間距離，連線則顯示一份文書如何引用、回應或引發另一份文書。</w:t>
+        <w:t>技能設計：規則、排除條件和證據要求如何工作？</w:t>
       </w:r>
     </w:p>
     <w:p>
@@ -2704,7 +2573,111 @@
           <w:rFonts w:cs="Apple LiSung"/>
           <w:lang w:eastAsia="zh-TW"/>
         </w:rPr>
-        <w:t>第一層：四條線分開事件、文書、皇帝回應和決策行動。</w:t>
+        <w:t>結果示例：輸出如何回到原文並進入網站？</w:t>
+      </w:r>
+    </w:p>
+    <w:p>
+      <w:pPr>
+        <w:pStyle w:val="Heading2"/>
+        <w:rPr>
+          <w:rFonts w:ascii="Apple LiSung" w:eastAsia="Apple LiSung" w:hAnsi="Apple LiSung" w:cs="Apple LiSung"/>
+          <w:lang w:eastAsia="zh-TW"/>
+        </w:rPr>
+      </w:pPr>
+    </w:p>
+    <w:p>
+      <w:pPr>
+        <w:pStyle w:val="Heading2"/>
+        <w:rPr>
+          <w:rFonts w:ascii="Apple LiSung" w:eastAsia="Apple LiSung" w:hAnsi="Apple LiSung" w:cs="Apple LiSung"/>
+          <w:lang w:eastAsia="zh-TW"/>
+        </w:rPr>
+      </w:pPr>
+    </w:p>
+    <w:p>
+      <w:pPr>
+        <w:pStyle w:val="Heading2"/>
+        <w:rPr>
+          <w:lang w:eastAsia="zh-TW"/>
+        </w:rPr>
+      </w:pPr>
+      <w:r>
+        <w:rPr>
+          <w:rFonts w:ascii="Apple LiSung" w:eastAsia="Apple LiSung" w:hAnsi="Apple LiSung" w:cs="Apple LiSung"/>
+          <w:lang w:eastAsia="zh-TW"/>
+        </w:rPr>
+        <w:t>5.4 網站介面：由圖表回到原文</w:t>
+      </w:r>
+    </w:p>
+    <w:p>
+      <w:pPr>
+        <w:rPr>
+          <w:lang w:eastAsia="zh-TW"/>
+        </w:rPr>
+      </w:pPr>
+      <w:r>
+        <w:rPr>
+          <w:rFonts w:cs="Apple LiSung"/>
+          <w:lang w:eastAsia="zh-TW"/>
+        </w:rPr>
+        <w:t>介面介紹應按照資料在網站中被使用的順序展開：先是宏觀圖表，再是文書和人工智能核驗區，最後是個別節點資訊及事件線。這個順序讓讀者明白，視覺化不是取代原文，而是提供一個進入原文和比較文書關係的入口。</w:t>
+      </w:r>
+    </w:p>
+    <w:p>
+      <w:pPr>
+        <w:pStyle w:val="Heading3"/>
+        <w:rPr>
+          <w:lang w:eastAsia="zh-TW"/>
+        </w:rPr>
+      </w:pPr>
+      <w:r>
+        <w:rPr>
+          <w:rFonts w:ascii="Apple LiSung" w:eastAsia="Apple LiSung" w:hAnsi="Apple LiSung" w:cs="Apple LiSung"/>
+          <w:lang w:eastAsia="zh-TW"/>
+        </w:rPr>
+        <w:t>5.4.1 四線圖表：呈現時間、事件和通信</w:t>
+      </w:r>
+    </w:p>
+    <w:p>
+      <w:pPr>
+        <w:rPr>
+          <w:lang w:eastAsia="zh-TW"/>
+        </w:rPr>
+      </w:pPr>
+      <w:r>
+        <w:rPr>
+          <w:rFonts w:cs="Apple LiSung"/>
+          <w:lang w:eastAsia="zh-TW"/>
+        </w:rPr>
+        <w:t>圖表以四條水平線分開不同類型的歷史資訊。第一條線呈現事件實際發生的時間；其他線分別呈現官員文書或奏報、皇帝的硃批與上諭，以及由皇帝評論、命令或行動形成的決策節點。四條線把「事情何時發生」、「官員何時報告」、「皇帝何時收到和回應」及「地方何時再次回報」放在同一時間尺度上。</w:t>
+      </w:r>
+    </w:p>
+    <w:p>
+      <w:pPr>
+        <w:rPr>
+          <w:lang w:eastAsia="zh-TW"/>
+        </w:rPr>
+      </w:pPr>
+      <w:r>
+        <w:rPr>
+          <w:rFonts w:cs="Apple LiSung"/>
+          <w:lang w:eastAsia="zh-TW"/>
+        </w:rPr>
+        <w:t>每個節點只有在人工智能技能提取出主題句、詳細描述、原文引文和日期，並由研究者核對批准後才會加入圖表。事件節點可以連到官員奏報節點，表示事件由哪份文書上報；奏報節點再連到硃批或上諭，表示皇帝何時接收和回應；皇帝行動節點則可以連到後續官員文書，表示地方何時回應或執行命令。</w:t>
+      </w:r>
+    </w:p>
+    <w:p>
+      <w:pPr>
+        <w:rPr>
+          <w:lang w:eastAsia="zh-TW"/>
+        </w:rPr>
+      </w:pPr>
+      <w:r>
+        <w:rPr>
+          <w:rFonts w:cs="Apple LiSung"/>
+          <w:lang w:eastAsia="zh-TW"/>
+        </w:rPr>
+        <w:t>因此，圖表同時具備時間線和通信網絡兩種功能。節點的位置顯示事件、發出、收受和回覆之間的時間距離，連線則顯示一份文書如何引用、回應或引發另一份文書。</w:t>
       </w:r>
     </w:p>
     <w:p>
@@ -2720,7 +2693,7 @@
           <w:rFonts w:cs="Apple LiSung"/>
           <w:lang w:eastAsia="zh-TW"/>
         </w:rPr>
-        <w:t>第二層：日期使資訊延遲變得可見。</w:t>
+        <w:t>第一層：四條線分開事件、文書、皇帝回應和決策行動。</w:t>
       </w:r>
     </w:p>
     <w:p>
@@ -2736,6 +2709,22 @@
           <w:rFonts w:cs="Apple LiSung"/>
           <w:lang w:eastAsia="zh-TW"/>
         </w:rPr>
+        <w:t>第二層：日期使資訊延遲變得可見。</w:t>
+      </w:r>
+    </w:p>
+    <w:p>
+      <w:pPr>
+        <w:pStyle w:val="ListBullet"/>
+        <w:spacing w:after="80" w:line="290" w:lineRule="auto"/>
+        <w:rPr>
+          <w:lang w:eastAsia="zh-TW"/>
+        </w:rPr>
+      </w:pPr>
+      <w:r>
+        <w:rPr>
+          <w:rFonts w:cs="Apple LiSung"/>
+          <w:lang w:eastAsia="zh-TW"/>
+        </w:rPr>
         <w:t>第三層：連線重建事件、奏報、硃批、上諭和後續回應的關係。</w:t>
       </w:r>
     </w:p>
@@ -2921,6 +2910,28 @@
     </w:p>
     <w:p>
       <w:pPr>
+        <w:spacing w:after="200" w:line="276" w:lineRule="auto"/>
+        <w:jc w:val="left"/>
+        <w:rPr>
+          <w:rFonts w:cs="Apple LiSung"/>
+          <w:b/>
+          <w:bCs/>
+          <w:color w:val="2E74B5"/>
+          <w:sz w:val="32"/>
+          <w:szCs w:val="28"/>
+          <w:lang w:eastAsia="zh-TW"/>
+        </w:rPr>
+      </w:pPr>
+      <w:r>
+        <w:rPr>
+          <w:rFonts w:cs="Apple LiSung"/>
+          <w:lang w:eastAsia="zh-TW"/>
+        </w:rPr>
+        <w:br w:type="page"/>
+      </w:r>
+    </w:p>
+    <w:p>
+      <w:pPr>
         <w:pStyle w:val="Heading1"/>
         <w:rPr>
           <w:lang w:eastAsia="zh-TW"/>
@@ -2931,6 +2942,7 @@
           <w:rFonts w:ascii="Apple LiSung" w:eastAsia="Apple LiSung" w:hAnsi="Apple LiSung" w:cs="Apple LiSung"/>
           <w:lang w:eastAsia="zh-TW"/>
         </w:rPr>
+        <w:lastRenderedPageBreak/>
         <w:t>六、重用平台於其他研究主題</w:t>
       </w:r>
     </w:p>
@@ -3046,94 +3058,94 @@
           <w:rFonts w:ascii="Apple LiSung" w:eastAsia="Apple LiSung" w:hAnsi="Apple LiSung" w:cs="Apple LiSung"/>
           <w:lang w:eastAsia="zh-TW"/>
         </w:rPr>
+        <w:t>6.1.2 代理式人工智能</w:t>
+      </w:r>
+    </w:p>
+    <w:p>
+      <w:pPr>
+        <w:rPr>
+          <w:lang w:eastAsia="zh-TW"/>
+        </w:rPr>
+      </w:pPr>
+      <w:r>
+        <w:rPr>
+          <w:rFonts w:cs="Apple LiSung"/>
+          <w:lang w:eastAsia="zh-TW"/>
+        </w:rPr>
+        <w:t>代理式人工智能可以讀取專案資料夾、修改多個檔案和執行指令，協助研究者把 OCR 文本轉為 JSON、調整 Skills、載入新資料集、修正程式錯誤、修改介面及加入新功能。教學應說明代理式工具是協作助手，不是可以不經檢查而自動改寫研究系統的黑箱。</w:t>
+      </w:r>
+    </w:p>
+    <w:p>
+      <w:pPr>
+        <w:pStyle w:val="Heading3"/>
+        <w:rPr>
+          <w:lang w:eastAsia="zh-TW"/>
+        </w:rPr>
+      </w:pPr>
+      <w:r>
+        <w:rPr>
+          <w:rFonts w:ascii="Apple LiSung" w:eastAsia="Apple LiSung" w:hAnsi="Apple LiSung" w:cs="Apple LiSung"/>
+          <w:lang w:eastAsia="zh-TW"/>
+        </w:rPr>
+        <w:t>6.1.3 AI API 與模型</w:t>
+      </w:r>
+    </w:p>
+    <w:p>
+      <w:pPr>
+        <w:rPr>
+          <w:lang w:eastAsia="zh-TW"/>
+        </w:rPr>
+      </w:pPr>
+      <w:r>
+        <w:rPr>
+          <w:rFonts w:cs="Apple LiSung"/>
+          <w:lang w:eastAsia="zh-TW"/>
+        </w:rPr>
+        <w:t>AI API 負責讓 Python 程式把文書和技能指令逐份送到人工智能模型，再接收結構化輸出。研究者選擇模型時，需要考慮準確度、上下文長度、成本、速度和資料敏感性。API 使用可能產生費用，帳戶、金鑰和研究資料也應按照安全規則管理，不應寫入公開原始碼。</w:t>
+      </w:r>
+    </w:p>
+    <w:p>
+      <w:pPr>
+        <w:pStyle w:val="Heading3"/>
+        <w:rPr>
+          <w:lang w:eastAsia="zh-TW"/>
+        </w:rPr>
+      </w:pPr>
+      <w:r>
+        <w:rPr>
+          <w:rFonts w:ascii="Apple LiSung" w:eastAsia="Apple LiSung" w:hAnsi="Apple LiSung" w:cs="Apple LiSung"/>
+          <w:lang w:eastAsia="zh-TW"/>
+        </w:rPr>
+        <w:t>6.1.4 其他軟件與來源</w:t>
+      </w:r>
+    </w:p>
+    <w:p>
+      <w:pPr>
+        <w:rPr>
+          <w:lang w:eastAsia="zh-TW"/>
+        </w:rPr>
+      </w:pPr>
+      <w:r>
+        <w:rPr>
+          <w:rFonts w:cs="Apple LiSung"/>
+          <w:lang w:eastAsia="zh-TW"/>
+        </w:rPr>
+        <w:t>本節集中列出 Python、Git、GitHub、終端機或程式碼編輯器、OCR 軟件、AI API、平台儲存庫及官方文件。每項工具只需要說明它在整體流程中的作用和基本安裝方向，避免把本網站變成某一個軟件品牌的操作手冊。</w:t>
+      </w:r>
+    </w:p>
+    <w:p>
+      <w:pPr>
+        <w:pStyle w:val="Heading2"/>
+        <w:rPr>
+          <w:lang w:eastAsia="zh-TW"/>
+        </w:rPr>
+      </w:pPr>
+      <w:r>
+        <w:rPr>
+          <w:rFonts w:ascii="Apple LiSung" w:eastAsia="Apple LiSung" w:hAnsi="Apple LiSung" w:cs="Apple LiSung"/>
+          <w:lang w:eastAsia="zh-TW"/>
+        </w:rPr>
         <w:lastRenderedPageBreak/>
-        <w:t>6.1.2 代理式人工智能</w:t>
-      </w:r>
-    </w:p>
-    <w:p>
-      <w:pPr>
-        <w:rPr>
-          <w:lang w:eastAsia="zh-TW"/>
-        </w:rPr>
-      </w:pPr>
-      <w:r>
-        <w:rPr>
-          <w:rFonts w:cs="Apple LiSung"/>
-          <w:lang w:eastAsia="zh-TW"/>
-        </w:rPr>
-        <w:t>代理式人工智能可以讀取專案資料夾、修改多個檔案和執行指令，協助研究者把 OCR 文本轉為 JSON、調整 Skills、載入新資料集、修正程式錯誤、修改介面及加入新功能。教學應說明代理式工具是協作助手，不是可以不經檢查而自動改寫研究系統的黑箱。</w:t>
-      </w:r>
-    </w:p>
-    <w:p>
-      <w:pPr>
-        <w:pStyle w:val="Heading3"/>
-        <w:rPr>
-          <w:lang w:eastAsia="zh-TW"/>
-        </w:rPr>
-      </w:pPr>
-      <w:r>
-        <w:rPr>
-          <w:rFonts w:ascii="Apple LiSung" w:eastAsia="Apple LiSung" w:hAnsi="Apple LiSung" w:cs="Apple LiSung"/>
-          <w:lang w:eastAsia="zh-TW"/>
-        </w:rPr>
-        <w:t>6.1.3 AI API 與模型</w:t>
-      </w:r>
-    </w:p>
-    <w:p>
-      <w:pPr>
-        <w:rPr>
-          <w:lang w:eastAsia="zh-TW"/>
-        </w:rPr>
-      </w:pPr>
-      <w:r>
-        <w:rPr>
-          <w:rFonts w:cs="Apple LiSung"/>
-          <w:lang w:eastAsia="zh-TW"/>
-        </w:rPr>
-        <w:t>AI API 負責讓 Python 程式把文書和技能指令逐份送到人工智能模型，再接收結構化輸出。研究者選擇模型時，需要考慮準確度、上下文長度、成本、速度和資料敏感性。API 使用可能產生費用，帳戶、金鑰和研究資料也應按照安全規則管理，不應寫入公開原始碼。</w:t>
-      </w:r>
-    </w:p>
-    <w:p>
-      <w:pPr>
-        <w:pStyle w:val="Heading3"/>
-        <w:rPr>
-          <w:lang w:eastAsia="zh-TW"/>
-        </w:rPr>
-      </w:pPr>
-      <w:r>
-        <w:rPr>
-          <w:rFonts w:ascii="Apple LiSung" w:eastAsia="Apple LiSung" w:hAnsi="Apple LiSung" w:cs="Apple LiSung"/>
-          <w:lang w:eastAsia="zh-TW"/>
-        </w:rPr>
-        <w:t>6.1.4 其他軟件與來源</w:t>
-      </w:r>
-    </w:p>
-    <w:p>
-      <w:pPr>
-        <w:rPr>
-          <w:lang w:eastAsia="zh-TW"/>
-        </w:rPr>
-      </w:pPr>
-      <w:r>
-        <w:rPr>
-          <w:rFonts w:cs="Apple LiSung"/>
-          <w:lang w:eastAsia="zh-TW"/>
-        </w:rPr>
-        <w:t>本節集中列出 Python、Git、GitHub、終端機或程式碼編輯器、OCR 軟件、AI API、平台儲存庫及官方文件。每項工具只需要說明它在整體流程中的作用和基本安裝方向，避免把本網站變成某一個軟件品牌的操作手冊。</w:t>
-      </w:r>
-    </w:p>
-    <w:p>
-      <w:pPr>
-        <w:pStyle w:val="Heading2"/>
-        <w:rPr>
-          <w:lang w:eastAsia="zh-TW"/>
-        </w:rPr>
-      </w:pPr>
-      <w:r>
-        <w:rPr>
-          <w:rFonts w:ascii="Apple LiSung" w:eastAsia="Apple LiSung" w:hAnsi="Apple LiSung" w:cs="Apple LiSung"/>
-          <w:lang w:eastAsia="zh-TW"/>
-        </w:rPr>
         <w:t>6.2 準備新的歷史材料</w:t>
       </w:r>
     </w:p>
@@ -3281,8 +3293,138 @@
           <w:rFonts w:cs="Apple LiSung"/>
           <w:lang w:eastAsia="zh-TW"/>
         </w:rPr>
+        <w:t>AI 產生的關係先作為候選結果載入核驗區。研究者確認日期、身份、原文引文和內容後，才把它加入圖表連線。這一節應展示資料如何由單純的時間序列逐步變成通信網絡。</w:t>
+      </w:r>
+    </w:p>
+    <w:p>
+      <w:pPr>
+        <w:pStyle w:val="Heading2"/>
+        <w:rPr>
+          <w:lang w:eastAsia="zh-TW"/>
+        </w:rPr>
+      </w:pPr>
+      <w:r>
+        <w:rPr>
+          <w:rFonts w:ascii="Apple LiSung" w:eastAsia="Apple LiSung" w:hAnsi="Apple LiSung" w:cs="Apple LiSung"/>
+          <w:lang w:eastAsia="zh-TW"/>
+        </w:rPr>
+        <w:t>6.4 重用及調整資訊提取框架</w:t>
+      </w:r>
+    </w:p>
+    <w:p>
+      <w:pPr>
+        <w:rPr>
+          <w:lang w:eastAsia="zh-TW"/>
+        </w:rPr>
+      </w:pPr>
+      <w:r>
+        <w:rPr>
+          <w:rFonts w:cs="Apple LiSung"/>
+          <w:lang w:eastAsia="zh-TW"/>
+        </w:rPr>
+        <w:t>平台最具重用性的部分，是把地方資訊、消息來源、中央回應和地方後續行動連成一個分析循環。這套結構可以應用於軍事、叛亂、災害救濟、稅收、司法、邊疆治理、外交和地方動亂等議題，但每個議題的具體分類和研究問題必須重新設計。</w:t>
+      </w:r>
+    </w:p>
+    <w:p>
+      <w:pPr>
+        <w:pStyle w:val="Heading3"/>
+        <w:rPr>
+          <w:lang w:eastAsia="zh-TW"/>
+        </w:rPr>
+      </w:pPr>
+      <w:r>
+        <w:rPr>
+          <w:rFonts w:ascii="Apple LiSung" w:eastAsia="Apple LiSung" w:hAnsi="Apple LiSung" w:cs="Apple LiSung"/>
+          <w:lang w:eastAsia="zh-TW"/>
+        </w:rPr>
+        <w:t>6.4.1 可保留的分析結構</w:t>
+      </w:r>
+    </w:p>
+    <w:p>
+      <w:pPr>
+        <w:rPr>
+          <w:lang w:eastAsia="zh-TW"/>
+        </w:rPr>
+      </w:pPr>
+      <w:r>
+        <w:rPr>
+          <w:rFonts w:cs="Apple LiSung"/>
+          <w:lang w:eastAsia="zh-TW"/>
+        </w:rPr>
+        <w:t>不論研究主題如何變化，研究者通常仍然可以追問：官員報告了甚麼資訊？資訊來自哪裡？中央或皇帝如何回應？地方官員後來如何回應或行動？這個循環可概括為「地方資訊 → 消息來源 → 中央回應 → 地方執行或回報」。</w:t>
+      </w:r>
+    </w:p>
+    <w:p>
+      <w:pPr>
+        <w:pStyle w:val="Heading3"/>
+        <w:rPr>
+          <w:lang w:eastAsia="zh-TW"/>
+        </w:rPr>
+      </w:pPr>
+      <w:r>
+        <w:rPr>
+          <w:rFonts w:ascii="Apple LiSung" w:eastAsia="Apple LiSung" w:hAnsi="Apple LiSung" w:cs="Apple LiSung"/>
+          <w:lang w:eastAsia="zh-TW"/>
+        </w:rPr>
         <w:lastRenderedPageBreak/>
-        <w:t>AI 產生的關係先作為候選結果載入核驗區。研究者確認日期、身份、原文引文和內容後，才把它加入圖表連線。這一節應展示資料如何由單純的時間序列逐步變成通信網絡。</w:t>
+        <w:t>6.4.2 必須調整的內容</w:t>
+      </w:r>
+    </w:p>
+    <w:p>
+      <w:pPr>
+        <w:rPr>
+          <w:lang w:eastAsia="zh-TW"/>
+        </w:rPr>
+      </w:pPr>
+      <w:r>
+        <w:rPr>
+          <w:rFonts w:cs="Apple LiSung"/>
+          <w:lang w:eastAsia="zh-TW"/>
+        </w:rPr>
+        <w:t>林爽文項目中的「林方行動」和「清方行動」，不能直接套用到其他題目。研究者可能需要改為海盜活動、外交行動、水災情況、糧價、地方社群回應、軍官移動、司法指控或賑災措施。調整時不只是替換分類名稱，也要重新思考哪些行動者、事件、時間和證據對新的研究問題最重要。</w:t>
+      </w:r>
+    </w:p>
+    <w:p>
+      <w:pPr>
+        <w:rPr>
+          <w:lang w:eastAsia="zh-TW"/>
+        </w:rPr>
+      </w:pPr>
+      <w:r>
+        <w:rPr>
+          <w:rFonts w:cs="Apple LiSung"/>
+          <w:lang w:eastAsia="zh-TW"/>
+        </w:rPr>
+        <w:t>代理式人工智能可以協助讀取原有 Skill 檔案，修改研究問題、分類定義、提取條件、JSON 欄位、例子、證據要求和排除規則；但研究者應先制定歷史分類，再要求工具協助實作。</w:t>
+      </w:r>
+    </w:p>
+    <w:p>
+      <w:pPr>
+        <w:pStyle w:val="Heading3"/>
+        <w:rPr>
+          <w:lang w:eastAsia="zh-TW"/>
+        </w:rPr>
+      </w:pPr>
+      <w:r>
+        <w:rPr>
+          <w:rFonts w:ascii="Apple LiSung" w:eastAsia="Apple LiSung" w:hAnsi="Apple LiSung" w:cs="Apple LiSung"/>
+          <w:lang w:eastAsia="zh-TW"/>
+        </w:rPr>
+        <w:t>6.4.3 保留證據與結構化輸出</w:t>
+      </w:r>
+    </w:p>
+    <w:p>
+      <w:pPr>
+        <w:rPr>
+          <w:lang w:eastAsia="zh-TW"/>
+        </w:rPr>
+      </w:pPr>
+      <w:r>
+        <w:rPr>
+          <w:rFonts w:cs="Apple LiSung"/>
+          <w:lang w:eastAsia="zh-TW"/>
+        </w:rPr>
+        <w:t>即使主題分類改變，幾項基本原則仍然應該保留：每個結果使用標準 JSON 結構，每項判斷包括原文引文和來源資料，不確定的情況明確標示，人工智能輸出在核驗前保持暫定，已確認結果才可成為圖表和篩選資料。這些原則確保新技能仍然能接入網站的核驗流程。</w:t>
       </w:r>
     </w:p>
     <w:p>
@@ -3297,136 +3439,6 @@
           <w:rFonts w:ascii="Apple LiSung" w:eastAsia="Apple LiSung" w:hAnsi="Apple LiSung" w:cs="Apple LiSung"/>
           <w:lang w:eastAsia="zh-TW"/>
         </w:rPr>
-        <w:t>6.4 重用及調整資訊提取框架</w:t>
-      </w:r>
-    </w:p>
-    <w:p>
-      <w:pPr>
-        <w:rPr>
-          <w:lang w:eastAsia="zh-TW"/>
-        </w:rPr>
-      </w:pPr>
-      <w:r>
-        <w:rPr>
-          <w:rFonts w:cs="Apple LiSung"/>
-          <w:lang w:eastAsia="zh-TW"/>
-        </w:rPr>
-        <w:t>平台最具重用性的部分，是把地方資訊、消息來源、中央回應和地方後續行動連成一個分析循環。這套結構可以應用於軍事、叛亂、災害救濟、稅收、司法、邊疆治理、外交和地方動亂等議題，但每個議題的具體分類和研究問題必須重新設計。</w:t>
-      </w:r>
-    </w:p>
-    <w:p>
-      <w:pPr>
-        <w:pStyle w:val="Heading3"/>
-        <w:rPr>
-          <w:lang w:eastAsia="zh-TW"/>
-        </w:rPr>
-      </w:pPr>
-      <w:r>
-        <w:rPr>
-          <w:rFonts w:ascii="Apple LiSung" w:eastAsia="Apple LiSung" w:hAnsi="Apple LiSung" w:cs="Apple LiSung"/>
-          <w:lang w:eastAsia="zh-TW"/>
-        </w:rPr>
-        <w:t>6.4.1 可保留的分析結構</w:t>
-      </w:r>
-    </w:p>
-    <w:p>
-      <w:pPr>
-        <w:rPr>
-          <w:lang w:eastAsia="zh-TW"/>
-        </w:rPr>
-      </w:pPr>
-      <w:r>
-        <w:rPr>
-          <w:rFonts w:cs="Apple LiSung"/>
-          <w:lang w:eastAsia="zh-TW"/>
-        </w:rPr>
-        <w:t>不論研究主題如何變化，研究者通常仍然可以追問：官員報告了甚麼資訊？資訊來自哪裡？中央或皇帝如何回應？地方官員後來如何回應或行動？這個循環可概括為「地方資訊 → 消息來源 → 中央回應 → 地方執行或回報」。</w:t>
-      </w:r>
-    </w:p>
-    <w:p>
-      <w:pPr>
-        <w:pStyle w:val="Heading3"/>
-        <w:rPr>
-          <w:lang w:eastAsia="zh-TW"/>
-        </w:rPr>
-      </w:pPr>
-      <w:r>
-        <w:rPr>
-          <w:rFonts w:ascii="Apple LiSung" w:eastAsia="Apple LiSung" w:hAnsi="Apple LiSung" w:cs="Apple LiSung"/>
-          <w:lang w:eastAsia="zh-TW"/>
-        </w:rPr>
-        <w:t>6.4.2 必須調整的內容</w:t>
-      </w:r>
-    </w:p>
-    <w:p>
-      <w:pPr>
-        <w:rPr>
-          <w:lang w:eastAsia="zh-TW"/>
-        </w:rPr>
-      </w:pPr>
-      <w:r>
-        <w:rPr>
-          <w:rFonts w:cs="Apple LiSung"/>
-          <w:lang w:eastAsia="zh-TW"/>
-        </w:rPr>
-        <w:t>林爽文項目中的「林方行動」和「清方行動」，不能直接套用到其他題目。研究者可能需要改為海盜活動、外交行動、水災情況、糧價、地方社群回應、軍官移動、司法指控或賑災措施。調整時不只是替換分類名稱，也要重新思考哪些行動者、事件、時間和證據對新的研究問題最重要。</w:t>
-      </w:r>
-    </w:p>
-    <w:p>
-      <w:pPr>
-        <w:rPr>
-          <w:lang w:eastAsia="zh-TW"/>
-        </w:rPr>
-      </w:pPr>
-      <w:r>
-        <w:rPr>
-          <w:rFonts w:cs="Apple LiSung"/>
-          <w:lang w:eastAsia="zh-TW"/>
-        </w:rPr>
-        <w:t>代理式人工智能可以協助讀取原有 Skill 檔案，修改研究問題、分類定義、提取條件、JSON 欄位、例子、證據要求和排除規則；但研究者應先制定歷史分類，再要求工具協助實作。</w:t>
-      </w:r>
-    </w:p>
-    <w:p>
-      <w:pPr>
-        <w:pStyle w:val="Heading3"/>
-        <w:rPr>
-          <w:lang w:eastAsia="zh-TW"/>
-        </w:rPr>
-      </w:pPr>
-      <w:r>
-        <w:rPr>
-          <w:rFonts w:ascii="Apple LiSung" w:eastAsia="Apple LiSung" w:hAnsi="Apple LiSung" w:cs="Apple LiSung"/>
-          <w:lang w:eastAsia="zh-TW"/>
-        </w:rPr>
-        <w:t>6.4.3 保留證據與結構化輸出</w:t>
-      </w:r>
-    </w:p>
-    <w:p>
-      <w:pPr>
-        <w:rPr>
-          <w:lang w:eastAsia="zh-TW"/>
-        </w:rPr>
-      </w:pPr>
-      <w:r>
-        <w:rPr>
-          <w:rFonts w:cs="Apple LiSung"/>
-          <w:lang w:eastAsia="zh-TW"/>
-        </w:rPr>
-        <w:t>即使主題分類改變，幾項基本原則仍然應該保留：每個結果使用標準 JSON 結構，每項判斷包括原文引文和來源資料，不確定的情況明確標示，人工智能輸出在核驗前保持暫定，已確認結果才可成為圖表和篩選資料。這些原則確保新技能仍然能接入網站的核驗流程。</w:t>
-      </w:r>
-    </w:p>
-    <w:p>
-      <w:pPr>
-        <w:pStyle w:val="Heading2"/>
-        <w:rPr>
-          <w:lang w:eastAsia="zh-TW"/>
-        </w:rPr>
-      </w:pPr>
-      <w:r>
-        <w:rPr>
-          <w:rFonts w:ascii="Apple LiSung" w:eastAsia="Apple LiSung" w:hAnsi="Apple LiSung" w:cs="Apple LiSung"/>
-          <w:lang w:eastAsia="zh-TW"/>
-        </w:rPr>
         <w:t>6.5 AI 處理循環</w:t>
       </w:r>
     </w:p>
@@ -3469,7 +3481,6 @@
           <w:rFonts w:cs="Apple LiSung"/>
           <w:lang w:eastAsia="zh-TW"/>
         </w:rPr>
-        <w:lastRenderedPageBreak/>
         <w:t>整個循環完成後，結構化結果才會被載入網站的人工智能分析區。研究者在網站中逐項核對，確認的資料才進入已確認資料集。這種「批次處理—網站核驗」的分工，讓大量資料可以有效處理，同時保留人文判斷和研究證據。</w:t>
       </w:r>
     </w:p>
@@ -3544,6 +3555,7 @@
           <w:rFonts w:ascii="Apple LiSung" w:eastAsia="Apple LiSung" w:hAnsi="Apple LiSung" w:cs="Apple LiSung"/>
           <w:lang w:eastAsia="zh-TW"/>
         </w:rPr>
+        <w:lastRenderedPageBreak/>
         <w:t>6.7 修改與擴展網站</w:t>
       </w:r>
     </w:p>
@@ -3606,6 +3618,28 @@
     </w:p>
     <w:p>
       <w:pPr>
+        <w:spacing w:after="200" w:line="276" w:lineRule="auto"/>
+        <w:jc w:val="left"/>
+        <w:rPr>
+          <w:rFonts w:cs="Apple LiSung"/>
+          <w:b/>
+          <w:bCs/>
+          <w:color w:val="2E74B5"/>
+          <w:sz w:val="32"/>
+          <w:szCs w:val="28"/>
+          <w:lang w:eastAsia="zh-TW"/>
+        </w:rPr>
+      </w:pPr>
+      <w:r>
+        <w:rPr>
+          <w:rFonts w:cs="Apple LiSung"/>
+          <w:lang w:eastAsia="zh-TW"/>
+        </w:rPr>
+        <w:br w:type="page"/>
+      </w:r>
+    </w:p>
+    <w:p>
+      <w:pPr>
         <w:pStyle w:val="Heading1"/>
         <w:rPr>
           <w:lang w:eastAsia="zh-TW"/>
@@ -3616,6 +3650,7 @@
           <w:rFonts w:ascii="Apple LiSung" w:eastAsia="Apple LiSung" w:hAnsi="Apple LiSung" w:cs="Apple LiSung"/>
           <w:lang w:eastAsia="zh-TW"/>
         </w:rPr>
+        <w:lastRenderedPageBreak/>
         <w:t>七、研究示範：林爽文事件</w:t>
       </w:r>
     </w:p>
@@ -3644,166 +3679,166 @@
           <w:rFonts w:cs="Apple LiSung"/>
           <w:lang w:eastAsia="zh-TW"/>
         </w:rPr>
+        <w:t>示範部分應把每個結論連回圖表節點和原始文書，清楚區分原文證據、人工智能提出的候選解讀和研究者最後確認的分析。這樣才能證明平台不是只產生漂亮圖表，而是可以支援有來源、有時間和有通信脈絡的歷史研究。</w:t>
+      </w:r>
+    </w:p>
+    <w:p>
+      <w:pPr>
+        <w:pStyle w:val="Heading2"/>
+        <w:rPr>
+          <w:lang w:eastAsia="zh-TW"/>
+        </w:rPr>
+      </w:pPr>
+      <w:r>
+        <w:rPr>
+          <w:rFonts w:ascii="Apple LiSung" w:eastAsia="Apple LiSung" w:hAnsi="Apple LiSung" w:cs="Apple LiSung"/>
+          <w:lang w:eastAsia="zh-TW"/>
+        </w:rPr>
+        <w:t>7.1 示範資料與研究範圍</w:t>
+      </w:r>
+    </w:p>
+    <w:p>
+      <w:pPr>
+        <w:rPr>
+          <w:lang w:eastAsia="zh-TW"/>
+        </w:rPr>
+      </w:pPr>
+      <w:r>
+        <w:rPr>
+          <w:rFonts w:cs="Apple LiSung"/>
+          <w:lang w:eastAsia="zh-TW"/>
+        </w:rPr>
+        <w:t>本節說明示範使用哪些奏摺、硃批和上諭，以及資料如何被結構化和載入平台。應列出資料範圍、文書數量、日期範圍和重要限制，讓讀者知道圖表呈現的是經過選取和核驗的研究資料，而不是清代所有相關文書。</w:t>
+      </w:r>
+    </w:p>
+    <w:p>
+      <w:pPr>
+        <w:pStyle w:val="Heading2"/>
+        <w:rPr>
+          <w:lang w:eastAsia="zh-TW"/>
+        </w:rPr>
+      </w:pPr>
+      <w:r>
+        <w:rPr>
+          <w:rFonts w:ascii="Apple LiSung" w:eastAsia="Apple LiSung" w:hAnsi="Apple LiSung" w:cs="Apple LiSung"/>
+          <w:lang w:eastAsia="zh-TW"/>
+        </w:rPr>
+        <w:t>7.2 從圖表重建資訊傳遞</w:t>
+      </w:r>
+    </w:p>
+    <w:p>
+      <w:pPr>
+        <w:rPr>
+          <w:lang w:eastAsia="zh-TW"/>
+        </w:rPr>
+      </w:pPr>
+      <w:r>
+        <w:rPr>
+          <w:rFonts w:cs="Apple LiSung"/>
+          <w:lang w:eastAsia="zh-TW"/>
+        </w:rPr>
+        <w:t>本節選取一至數條具代表性的通信鏈，展示事件在地方發生後，如何由官員奏摺傳到中央，皇帝何時透過硃批或上諭回應，以及地方官員何時作出後續回報。圖表應和原文區並列，讓讀者可由節點日期直接進入證據。</w:t>
+      </w:r>
+    </w:p>
+    <w:p>
+      <w:pPr>
+        <w:pStyle w:val="Heading2"/>
+        <w:rPr>
+          <w:lang w:eastAsia="zh-TW"/>
+        </w:rPr>
+      </w:pPr>
+      <w:r>
+        <w:rPr>
+          <w:rFonts w:ascii="Apple LiSung" w:eastAsia="Apple LiSung" w:hAnsi="Apple LiSung" w:cs="Apple LiSung"/>
+          <w:lang w:eastAsia="zh-TW"/>
+        </w:rPr>
+        <w:t>7.3 資訊延遲與軍事決策</w:t>
+      </w:r>
+    </w:p>
+    <w:p>
+      <w:pPr>
+        <w:rPr>
+          <w:lang w:eastAsia="zh-TW"/>
+        </w:rPr>
+      </w:pPr>
+      <w:r>
+        <w:rPr>
+          <w:rFonts w:cs="Apple LiSung"/>
+          <w:lang w:eastAsia="zh-TW"/>
+        </w:rPr>
+        <w:t>林爽文事件的示範可以特別分析事件發生、消息上報、皇帝獲悉、命令發布和地方回覆之間的時間距離。這些時間差不應被簡化成「延遲一定導致某結果」的結論，而應作為研究者分析決策條件、資訊落差和不同文書敘述的材料。</w:t>
+      </w:r>
+    </w:p>
+    <w:p>
+      <w:pPr>
+        <w:rPr>
+          <w:lang w:eastAsia="zh-TW"/>
+        </w:rPr>
+      </w:pPr>
+      <w:r>
+        <w:rPr>
+          <w:rFonts w:cs="Apple LiSung"/>
+          <w:lang w:eastAsia="zh-TW"/>
+        </w:rPr>
+        <w:t>本節可以展示同一事件的多份奏報，說明不同官員何時收到消息、如何描述消息來源，以及皇帝在上諭中掌握了哪些資訊。這能具體說明視覺化如何揭示單獨閱讀一份文書時不容易看見的關係。</w:t>
+      </w:r>
+    </w:p>
+    <w:p>
+      <w:pPr>
+        <w:pStyle w:val="Heading2"/>
+        <w:rPr>
+          <w:lang w:eastAsia="zh-TW"/>
+        </w:rPr>
+      </w:pPr>
+      <w:r>
+        <w:rPr>
+          <w:rFonts w:ascii="Apple LiSung" w:eastAsia="Apple LiSung" w:hAnsi="Apple LiSung" w:cs="Apple LiSung"/>
+          <w:lang w:eastAsia="zh-TW"/>
+        </w:rPr>
+        <w:t>7.4 平台帶來的歷史研究可能性</w:t>
+      </w:r>
+    </w:p>
+    <w:p>
+      <w:pPr>
+        <w:rPr>
+          <w:lang w:eastAsia="zh-TW"/>
+        </w:rPr>
+      </w:pPr>
+      <w:r>
+        <w:rPr>
+          <w:rFonts w:cs="Apple LiSung"/>
+          <w:lang w:eastAsia="zh-TW"/>
+        </w:rPr>
+        <w:t>示範結束時，網站應回到方法層面：平台不是替研究者自動解釋林爽文事件，而是使大量文書可以被整理、追蹤、比較和核驗。它讓研究者能夠同時研究事件本身、資訊如何流動、皇帝如何理解局勢，以及地方如何回應中央決策。</w:t>
+      </w:r>
+    </w:p>
+    <w:p>
+      <w:pPr>
+        <w:rPr>
+          <w:lang w:eastAsia="zh-TW"/>
+        </w:rPr>
+      </w:pPr>
+      <w:r>
+        <w:rPr>
+          <w:rFonts w:cs="Apple LiSung"/>
+          <w:lang w:eastAsia="zh-TW"/>
+        </w:rPr>
+        <w:t>最後可以指出，這套工作流程同樣可用於其他涉及中央—地方通信的清代研究。只要研究者重新選擇材料、定義問題、調整 Skills、執行 AI 處理循環並進行人文核驗，便能把平台延伸至不同的政治、軍事、司法和社會史題目。</w:t>
+      </w:r>
+    </w:p>
+    <w:p>
+      <w:pPr>
+        <w:pStyle w:val="Heading1"/>
+        <w:rPr>
+          <w:lang w:eastAsia="zh-TW"/>
+        </w:rPr>
+      </w:pPr>
+      <w:r>
+        <w:rPr>
+          <w:rFonts w:ascii="Apple LiSung" w:eastAsia="Apple LiSung" w:hAnsi="Apple LiSung" w:cs="Apple LiSung"/>
+          <w:lang w:eastAsia="zh-TW"/>
+        </w:rPr>
         <w:lastRenderedPageBreak/>
-        <w:t>示範部分應把每個結論連回圖表節點和原始文書，清楚區分原文證據、人工智能提出的候選解讀和研究者最後確認的分析。這樣才能證明平台不是只產生漂亮圖表，而是可以支援有來源、有時間和有通信脈絡的歷史研究。</w:t>
-      </w:r>
-    </w:p>
-    <w:p>
-      <w:pPr>
-        <w:pStyle w:val="Heading2"/>
-        <w:rPr>
-          <w:lang w:eastAsia="zh-TW"/>
-        </w:rPr>
-      </w:pPr>
-      <w:r>
-        <w:rPr>
-          <w:rFonts w:ascii="Apple LiSung" w:eastAsia="Apple LiSung" w:hAnsi="Apple LiSung" w:cs="Apple LiSung"/>
-          <w:lang w:eastAsia="zh-TW"/>
-        </w:rPr>
-        <w:t>7.1 示範資料與研究範圍</w:t>
-      </w:r>
-    </w:p>
-    <w:p>
-      <w:pPr>
-        <w:rPr>
-          <w:lang w:eastAsia="zh-TW"/>
-        </w:rPr>
-      </w:pPr>
-      <w:r>
-        <w:rPr>
-          <w:rFonts w:cs="Apple LiSung"/>
-          <w:lang w:eastAsia="zh-TW"/>
-        </w:rPr>
-        <w:t>本節說明示範使用哪些奏摺、硃批和上諭，以及資料如何被結構化和載入平台。應列出資料範圍、文書數量、日期範圍和重要限制，讓讀者知道圖表呈現的是經過選取和核驗的研究資料，而不是清代所有相關文書。</w:t>
-      </w:r>
-    </w:p>
-    <w:p>
-      <w:pPr>
-        <w:pStyle w:val="Heading2"/>
-        <w:rPr>
-          <w:lang w:eastAsia="zh-TW"/>
-        </w:rPr>
-      </w:pPr>
-      <w:r>
-        <w:rPr>
-          <w:rFonts w:ascii="Apple LiSung" w:eastAsia="Apple LiSung" w:hAnsi="Apple LiSung" w:cs="Apple LiSung"/>
-          <w:lang w:eastAsia="zh-TW"/>
-        </w:rPr>
-        <w:t>7.2 從圖表重建資訊傳遞</w:t>
-      </w:r>
-    </w:p>
-    <w:p>
-      <w:pPr>
-        <w:rPr>
-          <w:lang w:eastAsia="zh-TW"/>
-        </w:rPr>
-      </w:pPr>
-      <w:r>
-        <w:rPr>
-          <w:rFonts w:cs="Apple LiSung"/>
-          <w:lang w:eastAsia="zh-TW"/>
-        </w:rPr>
-        <w:t>本節選取一至數條具代表性的通信鏈，展示事件在地方發生後，如何由官員奏摺傳到中央，皇帝何時透過硃批或上諭回應，以及地方官員何時作出後續回報。圖表應和原文區並列，讓讀者可由節點日期直接進入證據。</w:t>
-      </w:r>
-    </w:p>
-    <w:p>
-      <w:pPr>
-        <w:pStyle w:val="Heading2"/>
-        <w:rPr>
-          <w:lang w:eastAsia="zh-TW"/>
-        </w:rPr>
-      </w:pPr>
-      <w:r>
-        <w:rPr>
-          <w:rFonts w:ascii="Apple LiSung" w:eastAsia="Apple LiSung" w:hAnsi="Apple LiSung" w:cs="Apple LiSung"/>
-          <w:lang w:eastAsia="zh-TW"/>
-        </w:rPr>
-        <w:t>7.3 資訊延遲與軍事決策</w:t>
-      </w:r>
-    </w:p>
-    <w:p>
-      <w:pPr>
-        <w:rPr>
-          <w:lang w:eastAsia="zh-TW"/>
-        </w:rPr>
-      </w:pPr>
-      <w:r>
-        <w:rPr>
-          <w:rFonts w:cs="Apple LiSung"/>
-          <w:lang w:eastAsia="zh-TW"/>
-        </w:rPr>
-        <w:t>林爽文事件的示範可以特別分析事件發生、消息上報、皇帝獲悉、命令發布和地方回覆之間的時間距離。這些時間差不應被簡化成「延遲一定導致某結果」的結論，而應作為研究者分析決策條件、資訊落差和不同文書敘述的材料。</w:t>
-      </w:r>
-    </w:p>
-    <w:p>
-      <w:pPr>
-        <w:rPr>
-          <w:lang w:eastAsia="zh-TW"/>
-        </w:rPr>
-      </w:pPr>
-      <w:r>
-        <w:rPr>
-          <w:rFonts w:cs="Apple LiSung"/>
-          <w:lang w:eastAsia="zh-TW"/>
-        </w:rPr>
-        <w:t>本節可以展示同一事件的多份奏報，說明不同官員何時收到消息、如何描述消息來源，以及皇帝在上諭中掌握了哪些資訊。這能具體說明視覺化如何揭示單獨閱讀一份文書時不容易看見的關係。</w:t>
-      </w:r>
-    </w:p>
-    <w:p>
-      <w:pPr>
-        <w:pStyle w:val="Heading2"/>
-        <w:rPr>
-          <w:lang w:eastAsia="zh-TW"/>
-        </w:rPr>
-      </w:pPr>
-      <w:r>
-        <w:rPr>
-          <w:rFonts w:ascii="Apple LiSung" w:eastAsia="Apple LiSung" w:hAnsi="Apple LiSung" w:cs="Apple LiSung"/>
-          <w:lang w:eastAsia="zh-TW"/>
-        </w:rPr>
-        <w:t>7.4 平台帶來的歷史研究可能性</w:t>
-      </w:r>
-    </w:p>
-    <w:p>
-      <w:pPr>
-        <w:rPr>
-          <w:lang w:eastAsia="zh-TW"/>
-        </w:rPr>
-      </w:pPr>
-      <w:r>
-        <w:rPr>
-          <w:rFonts w:cs="Apple LiSung"/>
-          <w:lang w:eastAsia="zh-TW"/>
-        </w:rPr>
-        <w:t>示範結束時，網站應回到方法層面：平台不是替研究者自動解釋林爽文事件，而是使大量文書可以被整理、追蹤、比較和核驗。它讓研究者能夠同時研究事件本身、資訊如何流動、皇帝如何理解局勢，以及地方如何回應中央決策。</w:t>
-      </w:r>
-    </w:p>
-    <w:p>
-      <w:pPr>
-        <w:rPr>
-          <w:lang w:eastAsia="zh-TW"/>
-        </w:rPr>
-      </w:pPr>
-      <w:r>
-        <w:rPr>
-          <w:rFonts w:cs="Apple LiSung"/>
-          <w:lang w:eastAsia="zh-TW"/>
-        </w:rPr>
-        <w:t>最後可以指出，這套工作流程同樣可用於其他涉及中央—地方通信的清代研究。只要研究者重新選擇材料、定義問題、調整 Skills、執行 AI 處理循環並進行人文核驗，便能把平台延伸至不同的政治、軍事、司法和社會史題目。</w:t>
-      </w:r>
-    </w:p>
-    <w:p>
-      <w:pPr>
-        <w:pStyle w:val="Heading1"/>
-        <w:rPr>
-          <w:lang w:eastAsia="zh-TW"/>
-        </w:rPr>
-      </w:pPr>
-      <w:r>
-        <w:rPr>
-          <w:rFonts w:ascii="Apple LiSung" w:eastAsia="Apple LiSung" w:hAnsi="Apple LiSung" w:cs="Apple LiSung"/>
-          <w:lang w:eastAsia="zh-TW"/>
-        </w:rPr>
         <w:t>八、結語：人工智能協助，研究者判斷</w:t>
       </w:r>
     </w:p>
@@ -3832,7 +3867,6 @@
           <w:rFonts w:cs="Apple LiSung"/>
           <w:lang w:eastAsia="zh-TW"/>
         </w:rPr>
-        <w:lastRenderedPageBreak/>
         <w:t>由此，平台的價值不只是提高閱讀速度，而是把閱讀、證據、判斷和視覺化整合成一個可重複、可追溯和可延伸的數位人文研究流程。</w:t>
       </w:r>
     </w:p>

</xml_diff>